<commit_message>
fixed clauses and subclauses
</commit_message>
<xml_diff>
--- a/docs/frontend_schema_briefing.docx
+++ b/docs/frontend_schema_briefing.docx
@@ -43,7 +43,7 @@
         <w:rPr>
           <w:sz w:val="21"/>
         </w:rPr>
-        <w:t xml:space="preserve"> (~43.6 MB)</w:t>
+        <w:t xml:space="preserve"> (~43.4 MB)</w:t>
       </w:r>
     </w:p>
     <w:p>
@@ -79,7 +79,7 @@
         <w:rPr>
           <w:sz w:val="21"/>
         </w:rPr>
-        <w:t xml:space="preserve"> 2026-04-11 (post-fix regeneration — subsection IDs, table captions, figure schema)</w:t>
+        <w:t xml:space="preserve"> 2026-04-15 (subclause boundary fix — nested roman numeral subclauses now parsed correctly; sentence/clause split correction for nested lists)</w:t>
       </w:r>
     </w:p>
     <w:p>
@@ -704,7 +704,7 @@
               <w:rPr>
                 <w:sz w:val="19"/>
               </w:rPr>
-              <w:t>5,663</w:t>
+              <w:t>5,664</w:t>
             </w:r>
           </w:p>
         </w:tc>
@@ -750,7 +750,7 @@
               <w:rPr>
                 <w:sz w:val="19"/>
               </w:rPr>
-              <w:t>3,695</w:t>
+              <w:t>4,201</w:t>
             </w:r>
           </w:p>
         </w:tc>
@@ -798,7 +798,7 @@
               <w:rPr>
                 <w:sz w:val="19"/>
               </w:rPr>
-              <w:t>111</w:t>
+              <w:t>1,078</w:t>
             </w:r>
           </w:p>
         </w:tc>
@@ -30695,7 +30695,7 @@
         <w:rPr>
           <w:sz w:val="21"/>
         </w:rPr>
-        <w:t>This section summarizes the breaking changes introduced in the 2026-04-11 regeneration. Any frontend code targeting the previous JSON must be updated.</w:t>
+        <w:t>This section summarizes the breaking changes from the 2026-04-11 and 2026-04-15 regenerations. Any frontend code targeting earlier JSON must be updated.</w:t>
       </w:r>
     </w:p>
     <w:tbl>
@@ -32432,6 +32432,429 @@
                 <w:sz w:val="17"/>
               </w:rPr>
               <w:t>row[i]</w:t>
+            </w:r>
+          </w:p>
+        </w:tc>
+      </w:tr>
+      <w:tr>
+        <w:tc>
+          <w:tcPr>
+            <w:tcW w:type="dxa" w:w="2340"/>
+            <w:tcBorders>
+              <w:top w:val="single" w:sz="4" w:space="0" w:color="CCCCCC"/>
+              <w:left w:val="single" w:sz="4" w:space="0" w:color="CCCCCC"/>
+              <w:bottom w:val="single" w:sz="4" w:space="0" w:color="CCCCCC"/>
+              <w:right w:val="single" w:sz="4" w:space="0" w:color="CCCCCC"/>
+            </w:tcBorders>
+            <w:shd w:val="clear" w:color="auto" w:fill="F8F9FA"/>
+          </w:tcPr>
+          <w:p>
+            <w:pPr>
+              <w:spacing w:before="40" w:after="40"/>
+            </w:pPr>
+            <w:r>
+              <w:rPr>
+                <w:sz w:val="19"/>
+              </w:rPr>
+              <w:t>Subclauses (roman) count</w:t>
+            </w:r>
+            <w:r>
+              <w:rPr>
+                <w:rFonts w:ascii="Courier New" w:hAnsi="Courier New"/>
+                <w:color w:val="C7254E"/>
+                <w:sz w:val="17"/>
+              </w:rPr>
+            </w:r>
+            <w:r>
+              <w:rPr>
+                <w:sz w:val="19"/>
+              </w:rPr>
+            </w:r>
+          </w:p>
+        </w:tc>
+        <w:tc>
+          <w:tcPr>
+            <w:tcW w:type="dxa" w:w="2340"/>
+            <w:tcBorders>
+              <w:top w:val="single" w:sz="4" w:space="0" w:color="CCCCCC"/>
+              <w:left w:val="single" w:sz="4" w:space="0" w:color="CCCCCC"/>
+              <w:bottom w:val="single" w:sz="4" w:space="0" w:color="CCCCCC"/>
+              <w:right w:val="single" w:sz="4" w:space="0" w:color="CCCCCC"/>
+            </w:tcBorders>
+            <w:shd w:val="clear" w:color="auto" w:fill="F8F9FA"/>
+          </w:tcPr>
+          <w:p>
+            <w:pPr>
+              <w:spacing w:before="40" w:after="40"/>
+            </w:pPr>
+            <w:r>
+              <w:rPr>
+                <w:rFonts w:ascii="Courier New" w:hAnsi="Courier New"/>
+                <w:color w:val="C7254E"/>
+                <w:sz w:val="17"/>
+              </w:rPr>
+              <w:t>111</w:t>
+            </w:r>
+          </w:p>
+        </w:tc>
+        <w:tc>
+          <w:tcPr>
+            <w:tcW w:type="dxa" w:w="2340"/>
+            <w:tcBorders>
+              <w:top w:val="single" w:sz="4" w:space="0" w:color="CCCCCC"/>
+              <w:left w:val="single" w:sz="4" w:space="0" w:color="CCCCCC"/>
+              <w:bottom w:val="single" w:sz="4" w:space="0" w:color="CCCCCC"/>
+              <w:right w:val="single" w:sz="4" w:space="0" w:color="CCCCCC"/>
+            </w:tcBorders>
+            <w:shd w:val="clear" w:color="auto" w:fill="F8F9FA"/>
+          </w:tcPr>
+          <w:p>
+            <w:pPr>
+              <w:spacing w:before="40" w:after="40"/>
+            </w:pPr>
+            <w:r>
+              <w:rPr>
+                <w:rFonts w:ascii="Courier New" w:hAnsi="Courier New"/>
+                <w:color w:val="C7254E"/>
+                <w:sz w:val="17"/>
+              </w:rPr>
+              <w:t>1,078</w:t>
+            </w:r>
+            <w:r>
+              <w:rPr>
+                <w:sz w:val="19"/>
+              </w:rPr>
+            </w:r>
+            <w:r>
+              <w:rPr>
+                <w:rFonts w:ascii="Courier New" w:hAnsi="Courier New"/>
+                <w:color w:val="C7254E"/>
+                <w:sz w:val="17"/>
+              </w:rPr>
+            </w:r>
+          </w:p>
+        </w:tc>
+        <w:tc>
+          <w:tcPr>
+            <w:tcW w:type="dxa" w:w="2340"/>
+            <w:tcBorders>
+              <w:top w:val="single" w:sz="4" w:space="0" w:color="CCCCCC"/>
+              <w:left w:val="single" w:sz="4" w:space="0" w:color="CCCCCC"/>
+              <w:bottom w:val="single" w:sz="4" w:space="0" w:color="CCCCCC"/>
+              <w:right w:val="single" w:sz="4" w:space="0" w:color="CCCCCC"/>
+            </w:tcBorders>
+            <w:shd w:val="clear" w:color="auto" w:fill="F8F9FA"/>
+          </w:tcPr>
+          <w:p>
+            <w:pPr>
+              <w:spacing w:before="40" w:after="40"/>
+            </w:pPr>
+            <w:r>
+              <w:rPr>
+                <w:sz w:val="19"/>
+              </w:rPr>
+              <w:t>No action — more subclauses now correctly structured as SUBCLAUSE-* nodes; previously absorbed inline into clause content</w:t>
+            </w:r>
+            <w:r>
+              <w:rPr>
+                <w:rFonts w:ascii="Courier New" w:hAnsi="Courier New"/>
+                <w:color w:val="C7254E"/>
+                <w:sz w:val="17"/>
+              </w:rPr>
+            </w:r>
+            <w:r>
+              <w:rPr>
+                <w:sz w:val="19"/>
+              </w:rPr>
+            </w:r>
+            <w:r>
+              <w:rPr>
+                <w:rFonts w:ascii="Courier New" w:hAnsi="Courier New"/>
+                <w:color w:val="C7254E"/>
+                <w:sz w:val="17"/>
+              </w:rPr>
+            </w:r>
+          </w:p>
+        </w:tc>
+      </w:tr>
+      <w:tr>
+        <w:tc>
+          <w:tcPr>
+            <w:tcW w:type="dxa" w:w="2340"/>
+            <w:tcBorders>
+              <w:top w:val="single" w:sz="4" w:space="0" w:color="CCCCCC"/>
+              <w:left w:val="single" w:sz="4" w:space="0" w:color="CCCCCC"/>
+              <w:bottom w:val="single" w:sz="4" w:space="0" w:color="CCCCCC"/>
+              <w:right w:val="single" w:sz="4" w:space="0" w:color="CCCCCC"/>
+            </w:tcBorders>
+            <w:shd w:val="clear" w:color="auto" w:fill="F8F9FA"/>
+          </w:tcPr>
+          <w:p>
+            <w:pPr>
+              <w:spacing w:before="40" w:after="40"/>
+            </w:pPr>
+            <w:r>
+              <w:rPr>
+                <w:sz w:val="19"/>
+              </w:rPr>
+              <w:t>Clauses (lettered) count</w:t>
+            </w:r>
+            <w:r>
+              <w:rPr>
+                <w:rFonts w:ascii="Courier New" w:hAnsi="Courier New"/>
+                <w:color w:val="C7254E"/>
+                <w:sz w:val="17"/>
+              </w:rPr>
+            </w:r>
+            <w:r>
+              <w:rPr>
+                <w:sz w:val="19"/>
+              </w:rPr>
+            </w:r>
+          </w:p>
+        </w:tc>
+        <w:tc>
+          <w:tcPr>
+            <w:tcW w:type="dxa" w:w="2340"/>
+            <w:tcBorders>
+              <w:top w:val="single" w:sz="4" w:space="0" w:color="CCCCCC"/>
+              <w:left w:val="single" w:sz="4" w:space="0" w:color="CCCCCC"/>
+              <w:bottom w:val="single" w:sz="4" w:space="0" w:color="CCCCCC"/>
+              <w:right w:val="single" w:sz="4" w:space="0" w:color="CCCCCC"/>
+            </w:tcBorders>
+            <w:shd w:val="clear" w:color="auto" w:fill="F8F9FA"/>
+          </w:tcPr>
+          <w:p>
+            <w:pPr>
+              <w:spacing w:before="40" w:after="40"/>
+            </w:pPr>
+            <w:r>
+              <w:rPr>
+                <w:rFonts w:ascii="Courier New" w:hAnsi="Courier New"/>
+                <w:color w:val="C7254E"/>
+                <w:sz w:val="17"/>
+              </w:rPr>
+              <w:t>3,695</w:t>
+            </w:r>
+          </w:p>
+        </w:tc>
+        <w:tc>
+          <w:tcPr>
+            <w:tcW w:type="dxa" w:w="2340"/>
+            <w:tcBorders>
+              <w:top w:val="single" w:sz="4" w:space="0" w:color="CCCCCC"/>
+              <w:left w:val="single" w:sz="4" w:space="0" w:color="CCCCCC"/>
+              <w:bottom w:val="single" w:sz="4" w:space="0" w:color="CCCCCC"/>
+              <w:right w:val="single" w:sz="4" w:space="0" w:color="CCCCCC"/>
+            </w:tcBorders>
+            <w:shd w:val="clear" w:color="auto" w:fill="F8F9FA"/>
+          </w:tcPr>
+          <w:p>
+            <w:pPr>
+              <w:spacing w:before="40" w:after="40"/>
+            </w:pPr>
+            <w:r>
+              <w:rPr>
+                <w:rFonts w:ascii="Courier New" w:hAnsi="Courier New"/>
+                <w:color w:val="C7254E"/>
+                <w:sz w:val="17"/>
+              </w:rPr>
+              <w:t>4,201</w:t>
+            </w:r>
+            <w:r>
+              <w:rPr>
+                <w:sz w:val="19"/>
+              </w:rPr>
+            </w:r>
+            <w:r>
+              <w:rPr>
+                <w:rFonts w:ascii="Courier New" w:hAnsi="Courier New"/>
+                <w:color w:val="C7254E"/>
+                <w:sz w:val="17"/>
+              </w:rPr>
+            </w:r>
+          </w:p>
+        </w:tc>
+        <w:tc>
+          <w:tcPr>
+            <w:tcW w:type="dxa" w:w="2340"/>
+            <w:tcBorders>
+              <w:top w:val="single" w:sz="4" w:space="0" w:color="CCCCCC"/>
+              <w:left w:val="single" w:sz="4" w:space="0" w:color="CCCCCC"/>
+              <w:bottom w:val="single" w:sz="4" w:space="0" w:color="CCCCCC"/>
+              <w:right w:val="single" w:sz="4" w:space="0" w:color="CCCCCC"/>
+            </w:tcBorders>
+            <w:shd w:val="clear" w:color="auto" w:fill="F8F9FA"/>
+          </w:tcPr>
+          <w:p>
+            <w:pPr>
+              <w:spacing w:before="40" w:after="40"/>
+            </w:pPr>
+            <w:r>
+              <w:rPr>
+                <w:sz w:val="19"/>
+              </w:rPr>
+              <w:t>No action — clauses previously merged with sentence intro text are now correctly split; sentence content fields are cleaner</w:t>
+            </w:r>
+            <w:r>
+              <w:rPr>
+                <w:rFonts w:ascii="Courier New" w:hAnsi="Courier New"/>
+                <w:color w:val="C7254E"/>
+                <w:sz w:val="17"/>
+              </w:rPr>
+            </w:r>
+            <w:r>
+              <w:rPr>
+                <w:sz w:val="19"/>
+              </w:rPr>
+            </w:r>
+            <w:r>
+              <w:rPr>
+                <w:rFonts w:ascii="Courier New" w:hAnsi="Courier New"/>
+                <w:color w:val="C7254E"/>
+                <w:sz w:val="17"/>
+              </w:rPr>
+            </w:r>
+          </w:p>
+        </w:tc>
+      </w:tr>
+      <w:tr>
+        <w:tc>
+          <w:tcPr>
+            <w:tcW w:type="dxa" w:w="2340"/>
+            <w:tcBorders>
+              <w:top w:val="single" w:sz="4" w:space="0" w:color="CCCCCC"/>
+              <w:left w:val="single" w:sz="4" w:space="0" w:color="CCCCCC"/>
+              <w:bottom w:val="single" w:sz="4" w:space="0" w:color="CCCCCC"/>
+              <w:right w:val="single" w:sz="4" w:space="0" w:color="CCCCCC"/>
+            </w:tcBorders>
+            <w:shd w:val="clear" w:color="auto" w:fill="F8F9FA"/>
+          </w:tcPr>
+          <w:p>
+            <w:pPr>
+              <w:spacing w:before="40" w:after="40"/>
+            </w:pPr>
+            <w:r>
+              <w:rPr>
+                <w:sz w:val="19"/>
+              </w:rPr>
+              <w:t>Sentence content truncation</w:t>
+            </w:r>
+            <w:r>
+              <w:rPr>
+                <w:rFonts w:ascii="Courier New" w:hAnsi="Courier New"/>
+                <w:color w:val="C7254E"/>
+                <w:sz w:val="17"/>
+              </w:rPr>
+            </w:r>
+            <w:r>
+              <w:rPr>
+                <w:sz w:val="19"/>
+              </w:rPr>
+            </w:r>
+          </w:p>
+        </w:tc>
+        <w:tc>
+          <w:tcPr>
+            <w:tcW w:type="dxa" w:w="2340"/>
+            <w:tcBorders>
+              <w:top w:val="single" w:sz="4" w:space="0" w:color="CCCCCC"/>
+              <w:left w:val="single" w:sz="4" w:space="0" w:color="CCCCCC"/>
+              <w:bottom w:val="single" w:sz="4" w:space="0" w:color="CCCCCC"/>
+              <w:right w:val="single" w:sz="4" w:space="0" w:color="CCCCCC"/>
+            </w:tcBorders>
+            <w:shd w:val="clear" w:color="auto" w:fill="F8F9FA"/>
+          </w:tcPr>
+          <w:p>
+            <w:pPr>
+              <w:spacing w:before="40" w:after="40"/>
+            </w:pPr>
+            <w:r>
+              <w:rPr>
+                <w:rFonts w:ascii="Courier New" w:hAnsi="Courier New"/>
+                <w:color w:val="C7254E"/>
+                <w:sz w:val="17"/>
+              </w:rPr>
+              <w:t>May include first clause marker inline (e.g. "conformance witha) ...")</w:t>
+            </w:r>
+          </w:p>
+        </w:tc>
+        <w:tc>
+          <w:tcPr>
+            <w:tcW w:type="dxa" w:w="2340"/>
+            <w:tcBorders>
+              <w:top w:val="single" w:sz="4" w:space="0" w:color="CCCCCC"/>
+              <w:left w:val="single" w:sz="4" w:space="0" w:color="CCCCCC"/>
+              <w:bottom w:val="single" w:sz="4" w:space="0" w:color="CCCCCC"/>
+              <w:right w:val="single" w:sz="4" w:space="0" w:color="CCCCCC"/>
+            </w:tcBorders>
+            <w:shd w:val="clear" w:color="auto" w:fill="F8F9FA"/>
+          </w:tcPr>
+          <w:p>
+            <w:pPr>
+              <w:spacing w:before="40" w:after="40"/>
+            </w:pPr>
+            <w:r>
+              <w:rPr>
+                <w:rFonts w:ascii="Courier New" w:hAnsi="Courier New"/>
+                <w:color w:val="C7254E"/>
+                <w:sz w:val="17"/>
+              </w:rPr>
+              <w:t>Sentence content ends cleanly before clause list (e.g. "conformance with")</w:t>
+            </w:r>
+            <w:r>
+              <w:rPr>
+                <w:sz w:val="19"/>
+              </w:rPr>
+            </w:r>
+            <w:r>
+              <w:rPr>
+                <w:rFonts w:ascii="Courier New" w:hAnsi="Courier New"/>
+                <w:color w:val="C7254E"/>
+                <w:sz w:val="17"/>
+              </w:rPr>
+            </w:r>
+          </w:p>
+        </w:tc>
+        <w:tc>
+          <w:tcPr>
+            <w:tcW w:type="dxa" w:w="2340"/>
+            <w:tcBorders>
+              <w:top w:val="single" w:sz="4" w:space="0" w:color="CCCCCC"/>
+              <w:left w:val="single" w:sz="4" w:space="0" w:color="CCCCCC"/>
+              <w:bottom w:val="single" w:sz="4" w:space="0" w:color="CCCCCC"/>
+              <w:right w:val="single" w:sz="4" w:space="0" w:color="CCCCCC"/>
+            </w:tcBorders>
+            <w:shd w:val="clear" w:color="auto" w:fill="F8F9FA"/>
+          </w:tcPr>
+          <w:p>
+            <w:pPr>
+              <w:spacing w:before="40" w:after="40"/>
+            </w:pPr>
+            <w:r>
+              <w:rPr>
+                <w:sz w:val="19"/>
+              </w:rPr>
+              <w:t>No action — parsing fix applied in parser; sentence.content is now the pure preamble text</w:t>
+            </w:r>
+            <w:r>
+              <w:rPr>
+                <w:rFonts w:ascii="Courier New" w:hAnsi="Courier New"/>
+                <w:color w:val="C7254E"/>
+                <w:sz w:val="17"/>
+              </w:rPr>
+            </w:r>
+            <w:r>
+              <w:rPr>
+                <w:sz w:val="19"/>
+              </w:rPr>
+            </w:r>
+            <w:r>
+              <w:rPr>
+                <w:rFonts w:ascii="Courier New" w:hAnsi="Courier New"/>
+                <w:color w:val="C7254E"/>
+                <w:sz w:val="17"/>
+              </w:rPr>
             </w:r>
           </w:p>
         </w:tc>

</xml_diff>